<commit_message>
fix(sync): isolate snapshot recovery and finalize production gates
</commit_message>
<xml_diff>
--- a/docs/sync-reliability-3.44.0/JACKYUN同步可靠性改造实施说明3.44.0.docx
+++ b/docs/sync-reliability-3.44.0/JACKYUN同步可靠性改造实施说明3.44.0.docx
@@ -55,7 +55,7 @@
           <w:color w:val="000000"/>
           <w:u w:val="none"/>
         </w:rPr>
-        <w:t>任务开始时本地实施工作区为4c55462，远程Main已前进至fd0a8d2，网站版本3.43.0，包含SEIUE只读同步功能。已安全快进干净工作区并保留该功能。根据新模块递增规则，本次网站版本使用3.44.0，避免按旧计划发布3.41.0造成倒退。Watch源码不在本次修改范围。</w:t>
+        <w:t>任务开始时本地实施工作区为4c55462，远程Main已前进至fd0a8d2，网站版本3.43.0，包含SEIUE只读同步功能。已安全快进干净工作区并保留该功能；实施期间Main另有3.43.1和3.43.2修复，将一并合入发布。根据新模块递增规则，本次网站版本使用3.44.0，避免按旧计划发布3.41.0造成倒退。Watch源码不在本次修改范围。</w:t>
       </w:r>
     </w:p>
     <w:p>
@@ -283,7 +283,7 @@
           <w:color w:val="000000"/>
           <w:u w:val="none"/>
         </w:rPr>
-        <w:t>复习操作的记录新增、间隔与熟练度计算、复习项目更新以及回执新增在一个数据库事务中完成。任务和计划操作也通过同一受限RPC处理。客户端不能直接插入回执，匿名角色不能读取。公开RPC是SECURITY INVOKER包装器；真正需要写入受保护回执的函数放在未公开schema内，验证当前身份及active账号，并对所有业务读写使用当前用户条件。</w:t>
+        <w:t>复习操作的记录新增、间隔与熟练度计算、复习项目更新以及回执新增在一个数据库事务中完成。任务和计划操作也通过同一受限RPC处理。本地任务与复习视图、上传意图在同一IndexedDB事务保存；新建任务的本机编号直接使用操作编号，避免离线后继续勾选时引用临时占位编号。客户端不能直接插入回执，匿名角色不能读取。公开RPC是SECURITY INVOKER包装器；真正需要写入受保护回执的函数放在未公开schema内，验证当前身份及active账号，并对所有业务读写使用当前用户条件。</w:t>
       </w:r>
     </w:p>
     <w:p>
@@ -622,7 +622,7 @@
                 <w:color w:val="000000"/>
                 <w:u w:val="none"/>
               </w:rPr>
-              <w:t>5个场景通过</w:t>
+              <w:t>7个场景通过</w:t>
             </w:r>
           </w:p>
         </w:tc>
@@ -791,7 +791,17 @@
           <w:color w:val="000000"/>
           <w:u w:val="none"/>
         </w:rPr>
-        <w:t>浏览器验证覆盖两标签页独立字段合并、刷新后文档及待上传意图恢复、原生旧页面写入后的重启恢复、账号投影隔离和原账号恢复。它使用合成身份及本机服务，不是正式账号跨设备验收。</w:t>
+        <w:t>浏览器验证覆盖两标签页独立字段合并、刷新后文档及待上传意图恢复、原生旧页面写入后的重启恢复、账号投影隔离和原账号恢复，以及业务快照与意图原子提交和配额失败回滚。它使用合成身份及本机服务，不是正式账号跨设备验收。</w:t>
+      </w:r>
+    </w:p>
+    <w:p>
+      <w:r>
+        <w:rPr>
+          <w:rFonts w:ascii="Microsoft YaHei" w:hAnsi="Microsoft YaHei" w:eastAsia="Microsoft YaHei"/>
+          <w:color w:val="000000"/>
+          <w:u w:val="none"/>
+        </w:rPr>
+        <w:t>合并后扩展学习回归185项通过、3项失败；失败涉及既有CUE偏好字段预期、游戏面板Hook夹具和移动工具栏aria-controls断言。核对Main发现相同实现或缺失已存在，本次未把这些失败描述为同步回归通过，也未扩大修改范围。</w:t>
       </w:r>
     </w:p>
     <w:p>

</xml_diff>

<commit_message>
docs(sync): record production migration and verified firewall cleanup
</commit_message>
<xml_diff>
--- a/docs/sync-reliability-3.44.0/JACKYUN同步可靠性改造实施说明3.44.0.docx
+++ b/docs/sync-reliability-3.44.0/JACKYUN同步可靠性改造实施说明3.44.0.docx
@@ -111,7 +111,7 @@
           <w:color w:val="000000"/>
           <w:u w:val="none"/>
         </w:rPr>
-        <w:t>Supabase业务幂等迁移已应用并完成回滚式数据库契约验证。Azure新增变化日志迁移需要管理员连接，目前本机连接超时；自动审批拒绝临时开放当前单个出口IP与数据库代理连接，原因是生产网络边界变更及规则清理失败可能留下入口。该拒绝未被绕过，也没有创建该临时规则。v4增量能力在确认迁移前保持关闭。</w:t>
+        <w:t>Supabase业务幂等迁移及Azure变化日志迁移均已应用。Azure迁移先因连接默认只读而安全回滚，随后仅在迁移会话显式开启写事务并完成。临时单IP网络规则经用户明确授权，执行后删除并核对。运行角色、旧v3写入日志、重复抑制、CAS、删除标记、账号序号和隔离均通过回滚式验证。v4仍关闭，等待真实账号灰度验收。</w:t>
       </w:r>
     </w:p>
     <w:p>
@@ -121,7 +121,7 @@
           <w:color w:val="000000"/>
           <w:u w:val="none"/>
         </w:rPr>
-        <w:t>测试和构建通过不等于真实账号两设备验收完成。最终Azure部署、Vercel生产部署、版本核对及仍待完成事项以同目录verification.json及任务最终回复为准。</w:t>
+        <w:t>网站3.44.0已通过Vercel生产部署并绑定jackyun.top，源码提交199fde9；Azure健康接口确认3.7.0。测试、构建和部署READY不等于真实账号两客户端验收完成，尚待登录会话完成该项验证；详细证据见verification.json。</w:t>
       </w:r>
     </w:p>
     <w:p>
@@ -867,7 +867,7 @@
           <w:color w:val="000000"/>
           <w:u w:val="none"/>
         </w:rPr>
-        <w:t>待完成事项包括Azure生产变化日志迁移与运行身份验证、v4灰度启用，以及真实账号两客户端编辑 上传确认 拉取 刷新和离线恢复。若需要临时网络规则，必须获得被自动审批明确要求的授权；只放行当前一个出口IP，迁移后立即删除，并再次检查规则列表。</w:t>
+        <w:t>Azure生产变化日志迁移与运行身份验证已完成，验证SQL保存在azure/tests/sync-v4.sql，所有夹具写入均回滚。待完成事项为真实账号v4灰度启用，以及两客户端编辑 上传确认 拉取 刷新和离线恢复。临时规则只允许当前单个出口IP，结束后删除并核对；未配置全量v4开关。</w:t>
       </w:r>
     </w:p>
     <w:p>

</xml_diff>